<commit_message>
feat: add local AI support with Ollama and LM Studio
- Introduced local AI providers (Ollama and LM Studio) that run on the user's computer.
- Updated developer and user guides to include instructions for setting up and using local AI.
- Modified AIQuickSwitch and SettingsDialog components to handle local AI providers.
- Enhanced error handling for local AI connections and model loading.
- Implemented feature switches to control local AI availability based on device type.
- Added device detection logic to differentiate between phones/tablets and computers.
- Updated provider definitions to include local AI options and their configurations.
</commit_message>
<xml_diff>
--- a/docs/USER_GUIDE.docx
+++ b/docs/USER_GUIDE.docx
@@ -93,10 +93,10 @@
     </w:p>
     <w:p>
       <w:pPr>
-        <w:spacing w:after="160"/>
         <w:pBdr>
           <w:bottom w:val="single" w:sz="6" w:space="1" w:color="D9DEE7"/>
         </w:pBdr>
+        <w:spacing w:after="160"/>
       </w:pPr>
     </w:p>
     <w:p>
@@ -607,9 +607,9 @@
     </w:p>
     <w:p>
       <w:pPr>
+        <w:shd w:val="clear" w:fill="F8FAFC"/>
         <w:spacing w:after="160"/>
         <w:ind w:left="360"/>
-        <w:shd w:val="clear" w:fill="F8FAFC"/>
       </w:pPr>
       <w:r>
         <w:rPr>
@@ -621,10 +621,311 @@
     </w:p>
     <w:p>
       <w:pPr>
-        <w:spacing w:after="160"/>
+        <w:pStyle w:val="Heading2"/>
+      </w:pPr>
+      <w:r>
+        <w:rPr>
+          <w:color w:val="0F172A"/>
+          <w:sz w:val="25"/>
+        </w:rPr>
+        <w:t xml:space="preserve">Local AI (computers only, when switched on)</w:t>
+      </w:r>
+    </w:p>
+    <w:p>
+      <w:r>
+        <w:rPr>
+          <w:color w:val="0F172A"/>
+          <w:sz w:val="21"/>
+        </w:rPr>
+        <w:t xml:space="preserve">Your team can switch on </w:t>
+      </w:r>
+      <w:r>
+        <w:rPr>
+          <w:b/>
+          <w:color w:val="0F172A"/>
+          <w:sz w:val="21"/>
+        </w:rPr>
+        <w:t xml:space="preserve">local AI</w:t>
+      </w:r>
+      <w:r>
+        <w:rPr>
+          <w:color w:val="0F172A"/>
+          <w:sz w:val="21"/>
+        </w:rPr>
+        <w:t xml:space="preserve">. Computers then also offer </w:t>
+      </w:r>
+      <w:r>
+        <w:rPr>
+          <w:b/>
+          <w:color w:val="0F172A"/>
+          <w:sz w:val="21"/>
+        </w:rPr>
+        <w:t xml:space="preserve">Ollama</w:t>
+      </w:r>
+      <w:r>
+        <w:rPr>
+          <w:color w:val="0F172A"/>
+          <w:sz w:val="21"/>
+        </w:rPr>
+        <w:t xml:space="preserve"> and </w:t>
+      </w:r>
+      <w:r>
+        <w:rPr>
+          <w:b/>
+          <w:color w:val="0F172A"/>
+          <w:sz w:val="21"/>
+        </w:rPr>
+        <w:t xml:space="preserve">LM Studio</w:t>
+      </w:r>
+      <w:r>
+        <w:rPr>
+          <w:color w:val="0F172A"/>
+          <w:sz w:val="21"/>
+        </w:rPr>
+        <w:t xml:space="preserve"> under </w:t>
+      </w:r>
+      <w:r>
+        <w:rPr>
+          <w:b/>
+          <w:color w:val="0F172A"/>
+          <w:sz w:val="21"/>
+        </w:rPr>
+        <w:t xml:space="preserve">Local</w:t>
+      </w:r>
+      <w:r>
+        <w:rPr>
+          <w:color w:val="0F172A"/>
+          <w:sz w:val="21"/>
+        </w:rPr>
+        <w:t xml:space="preserve"> in the AI list. They run the AI on your own computer: free, no key needed, and your text never leaves the machine. Phones and tablets never show them.</w:t>
+      </w:r>
+    </w:p>
+    <w:p>
+      <w:pPr>
+        <w:pStyle w:val="ListNumber"/>
+        <w:numPr>
+          <w:ilvl w:val="0"/>
+          <w:numId w:val="13"/>
+        </w:numPr>
+        <w:spacing w:after="60"/>
+      </w:pPr>
+      <w:r>
+        <w:rPr>
+          <w:color w:val="0F172A"/>
+          <w:sz w:val="21"/>
+        </w:rPr>
+        <w:t xml:space="preserve">Install Ollama from </w:t>
+      </w:r>
+      <w:r>
+        <w:rPr>
+          <w:color w:val="4F46E5"/>
+          <w:sz w:val="21"/>
+          <w:u w:val="single"/>
+        </w:rPr>
+        <w:t xml:space="preserve">https://ollama.com/download</w:t>
+      </w:r>
+      <w:r>
+        <w:rPr>
+          <w:color w:val="0F172A"/>
+          <w:sz w:val="21"/>
+        </w:rPr>
+        <w:t xml:space="preserve">.</w:t>
+      </w:r>
+    </w:p>
+    <w:p>
+      <w:pPr>
+        <w:pStyle w:val="ListNumber"/>
+        <w:numPr>
+          <w:ilvl w:val="0"/>
+          <w:numId w:val="13"/>
+        </w:numPr>
+        <w:spacing w:after="60"/>
+      </w:pPr>
+      <w:r>
+        <w:rPr>
+          <w:color w:val="0F172A"/>
+          <w:sz w:val="21"/>
+        </w:rPr>
+        <w:t xml:space="preserve">In a terminal, run </w:t>
+      </w:r>
+      <w:r>
+        <w:rPr>
+          <w:rFonts w:ascii="Consolas" w:hAnsi="Consolas"/>
+          <w:color w:val="1E293B"/>
+          <w:sz w:val="20"/>
+        </w:rPr>
+        <w:t xml:space="preserve">ollama pull llama3.2</w:t>
+      </w:r>
+      <w:r>
+        <w:rPr>
+          <w:color w:val="0F172A"/>
+          <w:sz w:val="21"/>
+        </w:rPr>
+        <w:t xml:space="preserve"> (or any model). Keep Ollama running.</w:t>
+      </w:r>
+    </w:p>
+    <w:p>
+      <w:pPr>
+        <w:pStyle w:val="ListNumber"/>
+        <w:numPr>
+          <w:ilvl w:val="0"/>
+          <w:numId w:val="13"/>
+        </w:numPr>
+        <w:spacing w:after="60"/>
+      </w:pPr>
+      <w:r>
+        <w:rPr>
+          <w:color w:val="0F172A"/>
+          <w:sz w:val="21"/>
+        </w:rPr>
+        <w:t xml:space="preserve">In SkillPath, choose </w:t>
+      </w:r>
+      <w:r>
+        <w:rPr>
+          <w:b/>
+          <w:color w:val="0F172A"/>
+          <w:sz w:val="21"/>
+        </w:rPr>
+        <w:t xml:space="preserve">Ollama</w:t>
+      </w:r>
+      <w:r>
+        <w:rPr>
+          <w:color w:val="0F172A"/>
+          <w:sz w:val="21"/>
+        </w:rPr>
+        <w:t xml:space="preserve"> under </w:t>
+      </w:r>
+      <w:r>
+        <w:rPr>
+          <w:b/>
+          <w:color w:val="0F172A"/>
+          <w:sz w:val="21"/>
+        </w:rPr>
+        <w:t xml:space="preserve">Local</w:t>
+      </w:r>
+      <w:r>
+        <w:rPr>
+          <w:color w:val="0F172A"/>
+          <w:sz w:val="21"/>
+        </w:rPr>
+        <w:t xml:space="preserve">, then click one of your installed models.</w:t>
+      </w:r>
+    </w:p>
+    <w:p>
+      <w:r>
+        <w:rPr>
+          <w:b/>
+          <w:color w:val="0F172A"/>
+          <w:sz w:val="21"/>
+        </w:rPr>
+        <w:t xml:space="preserve">If SkillPath can't reach Ollama</w:t>
+      </w:r>
+      <w:r>
+        <w:rPr>
+          <w:color w:val="0F172A"/>
+          <w:sz w:val="21"/>
+        </w:rPr>
+        <w:t xml:space="preserve">, make sure Ollama is running. If it is, it's blocking the page, and the message shows the exact fix: set </w:t>
+      </w:r>
+      <w:r>
+        <w:rPr>
+          <w:rFonts w:ascii="Consolas" w:hAnsi="Consolas"/>
+          <w:color w:val="1E293B"/>
+          <w:sz w:val="20"/>
+        </w:rPr>
+        <w:t xml:space="preserve">OLLAMA_ORIGINS</w:t>
+      </w:r>
+      <w:r>
+        <w:rPr>
+          <w:color w:val="0F172A"/>
+          <w:sz w:val="21"/>
+        </w:rPr>
+        <w:t xml:space="preserve"> to the SkillPath address, then quit Ollama and start it again. On Windows: </w:t>
+      </w:r>
+      <w:r>
+        <w:rPr>
+          <w:rFonts w:ascii="Consolas" w:hAnsi="Consolas"/>
+          <w:color w:val="1E293B"/>
+          <w:sz w:val="20"/>
+        </w:rPr>
+        <w:t xml:space="preserve">setx OLLAMA_ORIGINS "https://skill-path-rosy.vercel.app"</w:t>
+      </w:r>
+      <w:r>
+        <w:rPr>
+          <w:color w:val="0F172A"/>
+          <w:sz w:val="21"/>
+        </w:rPr>
+        <w:t xml:space="preserve">.</w:t>
+      </w:r>
+    </w:p>
+    <w:p>
+      <w:r>
+        <w:rPr>
+          <w:b/>
+          <w:color w:val="0F172A"/>
+          <w:sz w:val="21"/>
+        </w:rPr>
+        <w:t xml:space="preserve">LM Studio:</w:t>
+      </w:r>
+      <w:r>
+        <w:rPr>
+          <w:color w:val="0F172A"/>
+          <w:sz w:val="21"/>
+        </w:rPr>
+        <w:t xml:space="preserve"> download and load a model, start the server in the </w:t>
+      </w:r>
+      <w:r>
+        <w:rPr>
+          <w:b/>
+          <w:color w:val="0F172A"/>
+          <w:sz w:val="21"/>
+        </w:rPr>
+        <w:t xml:space="preserve">Developer</w:t>
+      </w:r>
+      <w:r>
+        <w:rPr>
+          <w:color w:val="0F172A"/>
+          <w:sz w:val="21"/>
+        </w:rPr>
+        <w:t xml:space="preserve"> tab, and turn on </w:t>
+      </w:r>
+      <w:r>
+        <w:rPr>
+          <w:b/>
+          <w:color w:val="0F172A"/>
+          <w:sz w:val="21"/>
+        </w:rPr>
+        <w:t xml:space="preserve">Enable CORS</w:t>
+      </w:r>
+      <w:r>
+        <w:rPr>
+          <w:color w:val="0F172A"/>
+          <w:sz w:val="21"/>
+        </w:rPr>
+        <w:t xml:space="preserve"> in </w:t>
+      </w:r>
+      <w:r>
+        <w:rPr>
+          <w:b/>
+          <w:color w:val="0F172A"/>
+          <w:sz w:val="21"/>
+        </w:rPr>
+        <w:t xml:space="preserve">Server Settings</w:t>
+      </w:r>
+      <w:r>
+        <w:rPr>
+          <w:color w:val="0F172A"/>
+          <w:sz w:val="21"/>
+        </w:rPr>
+        <w:t xml:space="preserve">.</w:t>
+      </w:r>
+    </w:p>
+    <w:p>
+      <w:pPr>
         <w:pBdr>
           <w:bottom w:val="single" w:sz="6" w:space="1" w:color="D9DEE7"/>
         </w:pBdr>
+        <w:spacing w:after="160"/>
       </w:pPr>
     </w:p>
     <w:p>
@@ -1063,10 +1364,10 @@
     </w:p>
     <w:p>
       <w:pPr>
-        <w:spacing w:after="160"/>
         <w:pBdr>
           <w:bottom w:val="single" w:sz="6" w:space="1" w:color="D9DEE7"/>
         </w:pBdr>
+        <w:spacing w:after="160"/>
       </w:pPr>
     </w:p>
     <w:p>
@@ -1352,9 +1653,9 @@
     </w:p>
     <w:p>
       <w:pPr>
+        <w:shd w:val="clear" w:fill="F8FAFC"/>
         <w:spacing w:after="160"/>
         <w:ind w:left="360"/>
-        <w:shd w:val="clear" w:fill="F8FAFC"/>
       </w:pPr>
       <w:r>
         <w:rPr>
@@ -2285,10 +2586,10 @@
     </w:p>
     <w:p>
       <w:pPr>
-        <w:spacing w:after="160"/>
         <w:pBdr>
           <w:bottom w:val="single" w:sz="6" w:space="1" w:color="D9DEE7"/>
         </w:pBdr>
+        <w:spacing w:after="160"/>
       </w:pPr>
     </w:p>
     <w:p>
@@ -2594,10 +2895,10 @@
     </w:p>
     <w:p>
       <w:pPr>
-        <w:spacing w:after="160"/>
         <w:pBdr>
           <w:bottom w:val="single" w:sz="6" w:space="1" w:color="D9DEE7"/>
         </w:pBdr>
+        <w:spacing w:after="160"/>
       </w:pPr>
     </w:p>
     <w:p>
@@ -2910,10 +3211,10 @@
     </w:tbl>
     <w:p>
       <w:pPr>
-        <w:spacing w:after="160"/>
         <w:pBdr>
           <w:bottom w:val="single" w:sz="6" w:space="1" w:color="D9DEE7"/>
         </w:pBdr>
+        <w:spacing w:after="160"/>
       </w:pPr>
     </w:p>
     <w:p>
@@ -3069,10 +3370,10 @@
     </w:p>
     <w:p>
       <w:pPr>
-        <w:spacing w:after="160"/>
         <w:pBdr>
           <w:bottom w:val="single" w:sz="6" w:space="1" w:color="D9DEE7"/>
         </w:pBdr>
+        <w:spacing w:after="160"/>
       </w:pPr>
     </w:p>
     <w:p>
@@ -3547,10 +3848,10 @@
     </w:p>
     <w:p>
       <w:pPr>
-        <w:spacing w:after="160"/>
         <w:pBdr>
           <w:bottom w:val="single" w:sz="6" w:space="1" w:color="D9DEE7"/>
         </w:pBdr>
+        <w:spacing w:after="160"/>
       </w:pPr>
     </w:p>
     <w:p>
@@ -3693,10 +3994,10 @@
     </w:p>
     <w:p>
       <w:pPr>
-        <w:spacing w:after="160"/>
         <w:pBdr>
           <w:bottom w:val="single" w:sz="6" w:space="1" w:color="D9DEE7"/>
         </w:pBdr>
+        <w:spacing w:after="160"/>
       </w:pPr>
     </w:p>
     <w:p>
@@ -3853,10 +4154,10 @@
     </w:p>
     <w:p>
       <w:pPr>
-        <w:spacing w:after="160"/>
         <w:pBdr>
           <w:bottom w:val="single" w:sz="6" w:space="1" w:color="D9DEE7"/>
         </w:pBdr>
+        <w:spacing w:after="160"/>
       </w:pPr>
     </w:p>
     <w:p>
@@ -4061,10 +4362,10 @@
     </w:p>
     <w:p>
       <w:pPr>
-        <w:spacing w:after="160"/>
         <w:pBdr>
           <w:bottom w:val="single" w:sz="6" w:space="1" w:color="D9DEE7"/>
         </w:pBdr>
+        <w:spacing w:after="160"/>
       </w:pPr>
     </w:p>
     <w:p>
@@ -4785,10 +5086,10 @@
     </w:p>
     <w:p>
       <w:pPr>
-        <w:spacing w:after="160"/>
         <w:pBdr>
           <w:bottom w:val="single" w:sz="6" w:space="1" w:color="D9DEE7"/>
         </w:pBdr>
+        <w:spacing w:after="160"/>
       </w:pPr>
     </w:p>
     <w:p>
@@ -5207,6 +5508,12 @@
     </w:lvlOverride>
   </w:num>
   <w:num w:numId="12">
+    <w:abstractNumId w:val="7"/>
+    <w:lvlOverride w:ilvl="0">
+      <w:startOverride w:val="1"/>
+    </w:lvlOverride>
+  </w:num>
+  <w:num w:numId="13">
     <w:abstractNumId w:val="7"/>
     <w:lvlOverride w:ilvl="0">
       <w:startOverride w:val="1"/>

</xml_diff>